<commit_message>
Add optional demo login seeded from DEMO_EMAIL / DEMO_PASSWORD
</commit_message>
<xml_diff>
--- a/docs/FinMan-Project-Report.docx
+++ b/docs/FinMan-Project-Report.docx
@@ -14637,7 +14637,7 @@
         <w:spacing w:after="80" w:line="276"/>
       </w:pPr>
       <w:r>
-        <w:t xml:space="preserve">Sign in. Show that the API returns 401 without the session cookie.</w:t>
+        <w:t xml:space="preserve">Sign in with the demo account (demo@gmail.com / demo123). Show that the API returns 401 without the session cookie.</w:t>
       </w:r>
     </w:p>
     <w:p>
@@ -16094,6 +16094,66 @@
                 <w:szCs w:val="19"/>
               </w:rPr>
               <w:t xml:space="preserve">The login the seed script creates or updates</w:t>
+            </w:r>
+          </w:p>
+        </w:tc>
+      </w:tr>
+      <w:tr>
+        <w:tc>
+          <w:tcPr>
+            <w:tcW w:type="dxa" w:w="3000"/>
+            <w:tcBorders>
+              <w:top w:val="single" w:color="D9CECD" w:sz="4"/>
+              <w:left w:val="single" w:color="D9CECD" w:sz="4"/>
+              <w:bottom w:val="single" w:color="D9CECD" w:sz="4"/>
+              <w:right w:val="single" w:color="D9CECD" w:sz="4"/>
+            </w:tcBorders>
+            <w:tcMar>
+              <w:top w:type="dxa" w:w="60"/>
+              <w:left w:type="dxa" w:w="100"/>
+              <w:bottom w:type="dxa" w:w="60"/>
+              <w:right w:type="dxa" w:w="100"/>
+            </w:tcMar>
+          </w:tcPr>
+          <w:p>
+            <w:pPr>
+              <w:spacing w:after="20" w:line="252"/>
+            </w:pPr>
+            <w:r>
+              <w:rPr>
+                <w:sz w:val="19"/>
+                <w:szCs w:val="19"/>
+              </w:rPr>
+              <w:t xml:space="preserve">DEMO_EMAIL, DEMO_PASSWORD</w:t>
+            </w:r>
+          </w:p>
+        </w:tc>
+        <w:tc>
+          <w:tcPr>
+            <w:tcW w:type="dxa" w:w="6746"/>
+            <w:tcBorders>
+              <w:top w:val="single" w:color="D9CECD" w:sz="4"/>
+              <w:left w:val="single" w:color="D9CECD" w:sz="4"/>
+              <w:bottom w:val="single" w:color="D9CECD" w:sz="4"/>
+              <w:right w:val="single" w:color="D9CECD" w:sz="4"/>
+            </w:tcBorders>
+            <w:tcMar>
+              <w:top w:type="dxa" w:w="60"/>
+              <w:left w:type="dxa" w:w="100"/>
+              <w:bottom w:type="dxa" w:w="60"/>
+              <w:right w:type="dxa" w:w="100"/>
+            </w:tcMar>
+          </w:tcPr>
+          <w:p>
+            <w:pPr>
+              <w:spacing w:after="20" w:line="252"/>
+            </w:pPr>
+            <w:r>
+              <w:rPr>
+                <w:sz w:val="19"/>
+                <w:szCs w:val="19"/>
+              </w:rPr>
+              <w:t xml:space="preserve">Optional second login for the demo (demo@gmail.com / demo123 on the demo machine only)</w:t>
             </w:r>
           </w:p>
         </w:tc>

</xml_diff>

<commit_message>
Report: drop the plagiarism section, fix spacing on the title page
</commit_message>
<xml_diff>
--- a/docs/FinMan-Project-Report.docx
+++ b/docs/FinMan-Project-Report.docx
@@ -168,7 +168,7 @@
           <w:sz w:val="28"/>
           <w:szCs w:val="28"/>
         </w:rPr>
-        <w:t>Soham</w:t>
+        <w:t xml:space="preserve">Soham </w:t>
       </w:r>
       <w:r>
         <w:rPr>
@@ -2676,60 +2676,6 @@
                 <w:noProof/>
               </w:rPr>
               <w:instrText>PAGEREF _Toc46 \h</w:instrText>
-            </w:r>
-            <w:r>
-              <w:rPr>
-                <w:noProof/>
-              </w:rPr>
-            </w:r>
-            <w:r>
-              <w:rPr>
-                <w:noProof/>
-              </w:rPr>
-              <w:fldChar w:fldCharType="separate"/>
-            </w:r>
-            <w:r>
-              <w:rPr>
-                <w:noProof/>
-              </w:rPr>
-              <w:fldChar w:fldCharType="end"/>
-            </w:r>
-          </w:hyperlink>
-        </w:p>
-        <w:p>
-          <w:pPr>
-            <w:tabs>
-              <w:tab w:val="right" w:leader="dot" w:pos="9746"/>
-            </w:tabs>
-            <w:ind w:left="220"/>
-            <w:rPr>
-              <w:noProof/>
-            </w:rPr>
-          </w:pPr>
-          <w:hyperlink w:anchor="_Toc47" w:history="1">
-            <w:r>
-              <w:rPr>
-                <w:noProof/>
-              </w:rPr>
-              <w:t>8.5 Plagiarism report</w:t>
-            </w:r>
-            <w:r>
-              <w:rPr>
-                <w:noProof/>
-              </w:rPr>
-              <w:tab/>
-            </w:r>
-            <w:r>
-              <w:rPr>
-                <w:noProof/>
-              </w:rPr>
-              <w:fldChar w:fldCharType="begin"/>
-            </w:r>
-            <w:r>
-              <w:rPr>
-                <w:noProof/>
-              </w:rPr>
-              <w:instrText>PAGEREF _Toc47 \h</w:instrText>
             </w:r>
             <w:r>
               <w:rPr>
@@ -22255,24 +22201,6 @@
       </w:pPr>
       <w:r>
         <w:t>Monthly budgets with alerts, and change streams to push new entries to an open dashboard in real time.</w:t>
-      </w:r>
-    </w:p>
-    <w:p>
-      <w:pPr>
-        <w:pStyle w:val="Heading2"/>
-      </w:pPr>
-      <w:bookmarkStart w:id="46" w:name="_Toc47"/>
-      <w:r>
-        <w:t>8.5 Plagiarism report</w:t>
-      </w:r>
-      <w:bookmarkEnd w:id="46"/>
-    </w:p>
-    <w:p>
-      <w:pPr>
-        <w:spacing w:after="140" w:line="288" w:lineRule="auto"/>
-      </w:pPr>
-      <w:r>
-        <w:t>[Attach the plagiarism report generated by the institute's tool here before submission.]</w:t>
       </w:r>
     </w:p>
     <w:p>

</xml_diff>

<commit_message>
Report: drop stale page-break markers that showed a blank page 2 in some viewers
</commit_message>
<xml_diff>
--- a/docs/FinMan-Project-Report.docx
+++ b/docs/FinMan-Project-Report.docx
@@ -201,7 +201,6 @@
       </w:pPr>
       <w:bookmarkStart w:id="0" w:name="_Toc1"/>
       <w:r>
-        <w:lastRenderedPageBreak/>
         <w:t>Contents</w:t>
       </w:r>
       <w:bookmarkEnd w:id="0"/>
@@ -2834,7 +2833,6 @@
       </w:pPr>
       <w:bookmarkStart w:id="1" w:name="_Toc2"/>
       <w:r>
-        <w:lastRenderedPageBreak/>
         <w:t>1. Problem identification</w:t>
       </w:r>
       <w:bookmarkEnd w:id="1"/>
@@ -3387,7 +3385,6 @@
                 <w:sz w:val="19"/>
                 <w:szCs w:val="19"/>
               </w:rPr>
-              <w:lastRenderedPageBreak/>
               <w:t>Responsive web app for laptop and phone browsers</w:t>
             </w:r>
           </w:p>
@@ -3435,7 +3432,6 @@
       </w:pPr>
       <w:bookmarkStart w:id="6" w:name="_Toc7"/>
       <w:r>
-        <w:lastRenderedPageBreak/>
         <w:t>2. NoSQL database selection</w:t>
       </w:r>
       <w:bookmarkEnd w:id="6"/>
@@ -4999,7 +4995,6 @@
                 <w:sz w:val="19"/>
                 <w:szCs w:val="19"/>
               </w:rPr>
-              <w:lastRenderedPageBreak/>
               <w:t>Database</w:t>
             </w:r>
           </w:p>
@@ -5830,7 +5825,6 @@
       </w:pPr>
       <w:bookmarkStart w:id="11" w:name="_Toc12"/>
       <w:r>
-        <w:lastRenderedPageBreak/>
         <w:t xml:space="preserve">3. Database design and data </w:t>
       </w:r>
       <w:proofErr w:type="spellStart"/>
@@ -7110,7 +7104,6 @@
       </w:pPr>
       <w:bookmarkStart w:id="14" w:name="_Toc15"/>
       <w:r>
-        <w:lastRenderedPageBreak/>
         <w:t xml:space="preserve">3.3 </w:t>
       </w:r>
       <w:proofErr w:type="spellStart"/>
@@ -8483,7 +8476,6 @@
         <w:spacing w:after="80" w:line="276" w:lineRule="auto"/>
       </w:pPr>
       <w:r>
-        <w:lastRenderedPageBreak/>
         <w:t>Every frequent query is served by an index, so response time depends on the size of the result, not the size of the collection (measured in section 5.2).</w:t>
       </w:r>
     </w:p>
@@ -8678,7 +8670,6 @@
       </w:pPr>
       <w:bookmarkStart w:id="18" w:name="_Toc19"/>
       <w:r>
-        <w:lastRenderedPageBreak/>
         <w:t>4. NoSQL database implementation and CRUD</w:t>
       </w:r>
       <w:bookmarkEnd w:id="18"/>
@@ -11516,7 +11507,6 @@
           <w:sz w:val="17"/>
           <w:szCs w:val="17"/>
         </w:rPr>
-        <w:lastRenderedPageBreak/>
         <w:t>const</w:t>
       </w:r>
       <w:proofErr w:type="spellEnd"/>
@@ -12113,7 +12103,6 @@
         <w:rPr>
           <w:noProof/>
         </w:rPr>
-        <w:lastRenderedPageBreak/>
         <w:drawing>
           <wp:inline distT="0" distB="0" distL="0" distR="0" wp14:anchorId="6F847A54" wp14:editId="4855E3FF">
             <wp:extent cx="5943600" cy="3714750"/>
@@ -12233,7 +12222,6 @@
       </w:pPr>
       <w:bookmarkStart w:id="24" w:name="_Toc25"/>
       <w:r>
-        <w:lastRenderedPageBreak/>
         <w:t>5. Advanced features and query optimisation</w:t>
       </w:r>
       <w:bookmarkEnd w:id="24"/>
@@ -14439,7 +14427,6 @@
           <w:sz w:val="19"/>
           <w:szCs w:val="19"/>
         </w:rPr>
-        <w:lastRenderedPageBreak/>
         <w:t>npm</w:t>
       </w:r>
       <w:proofErr w:type="spellEnd"/>
@@ -15286,7 +15273,6 @@
         <w:rPr>
           <w:noProof/>
         </w:rPr>
-        <w:lastRenderedPageBreak/>
         <w:drawing>
           <wp:inline distT="0" distB="0" distL="0" distR="0" wp14:anchorId="7D8ACA6B" wp14:editId="508454AB">
             <wp:extent cx="5943600" cy="3714750"/>
@@ -15966,7 +15952,6 @@
         <w:rPr>
           <w:noProof/>
         </w:rPr>
-        <w:lastRenderedPageBreak/>
         <w:drawing>
           <wp:inline distT="0" distB="0" distL="0" distR="0" wp14:anchorId="7FB1103D" wp14:editId="46C8F87C">
             <wp:extent cx="5943600" cy="3714750"/>
@@ -16203,7 +16188,6 @@
       </w:pPr>
       <w:bookmarkStart w:id="30" w:name="_Toc31"/>
       <w:r>
-        <w:lastRenderedPageBreak/>
         <w:t>6. Application integration</w:t>
       </w:r>
       <w:bookmarkEnd w:id="30"/>
@@ -16496,7 +16480,6 @@
         <w:rPr>
           <w:noProof/>
         </w:rPr>
-        <w:lastRenderedPageBreak/>
         <w:drawing>
           <wp:inline distT="0" distB="0" distL="0" distR="0" wp14:anchorId="0D9BB85A" wp14:editId="29FC1F53">
             <wp:extent cx="5943600" cy="3714750"/>
@@ -16627,7 +16610,6 @@
         <w:rPr>
           <w:noProof/>
         </w:rPr>
-        <w:lastRenderedPageBreak/>
         <w:drawing>
           <wp:inline distT="0" distB="0" distL="0" distR="0" wp14:anchorId="55DC931D" wp14:editId="0A04A3B8">
             <wp:extent cx="5943600" cy="3714750"/>
@@ -16758,7 +16740,6 @@
         <w:rPr>
           <w:noProof/>
         </w:rPr>
-        <w:lastRenderedPageBreak/>
         <w:drawing>
           <wp:inline distT="0" distB="0" distL="0" distR="0" wp14:anchorId="515A7688" wp14:editId="16821EDE">
             <wp:extent cx="5943600" cy="3714750"/>
@@ -16889,7 +16870,6 @@
         <w:rPr>
           <w:noProof/>
         </w:rPr>
-        <w:lastRenderedPageBreak/>
         <w:drawing>
           <wp:inline distT="0" distB="0" distL="0" distR="0" wp14:anchorId="24B9710A" wp14:editId="79325CE1">
             <wp:extent cx="2095500" cy="4533900"/>
@@ -17163,7 +17143,6 @@
       </w:pPr>
       <w:bookmarkStart w:id="35" w:name="_Toc36"/>
       <w:r>
-        <w:lastRenderedPageBreak/>
         <w:t>7. Testing, security and data validation</w:t>
       </w:r>
       <w:bookmarkEnd w:id="35"/>
@@ -18455,7 +18434,6 @@
                 <w:sz w:val="19"/>
                 <w:szCs w:val="19"/>
               </w:rPr>
-              <w:lastRenderedPageBreak/>
               <w:t>Suite</w:t>
             </w:r>
           </w:p>
@@ -20572,7 +20550,6 @@
       </w:pPr>
       <w:bookmarkStart w:id="41" w:name="_Toc42"/>
       <w:r>
-        <w:lastRenderedPageBreak/>
         <w:t>8. Demonstration, viva and documentation</w:t>
       </w:r>
       <w:bookmarkEnd w:id="41"/>
@@ -21541,7 +21518,6 @@
                 <w:sz w:val="19"/>
                 <w:szCs w:val="19"/>
               </w:rPr>
-              <w:lastRenderedPageBreak/>
               <w:t>Why copy the category name into each transaction?</w:t>
             </w:r>
           </w:p>
@@ -22210,7 +22186,6 @@
       </w:pPr>
       <w:bookmarkStart w:id="47" w:name="_Toc48"/>
       <w:r>
-        <w:lastRenderedPageBreak/>
         <w:t>Appendix A: Environment variables</w:t>
       </w:r>
       <w:bookmarkEnd w:id="47"/>

</xml_diff>

<commit_message>
Use Groq qwen/qwen3.8-27b; report and diagram updated, AI check passes 7 of 7
</commit_message>
<xml_diff>
--- a/docs/FinMan-Project-Report.docx
+++ b/docs/FinMan-Project-Report.docx
@@ -16303,7 +16303,7 @@
       </w:r>
       <w:proofErr w:type="gramEnd"/>
       <w:r>
-        <w:t>. The Hugging Face token lives only on the server; the browser never sees it.</w:t>
+        <w:t>. The AI API key lives only on the server; the browser never sees it.</w:t>
       </w:r>
     </w:p>
     <w:p>
@@ -16339,7 +16339,7 @@
         <w:spacing w:after="80" w:line="276" w:lineRule="auto"/>
       </w:pPr>
       <w:r>
-        <w:t xml:space="preserve">The Hugging Face router is called with </w:t>
+        <w:t xml:space="preserve">The AI provider (Groq by default; any OpenAI-compatible API works) is called with </w:t>
       </w:r>
       <w:r>
         <w:rPr>
@@ -18380,7 +18380,7 @@
         <w:t>docs/test-results.txt</w:t>
       </w:r>
       <w:r>
-        <w:t>). The integration tests start a throwaway MongoDB replica set in memory, run the real Express app against it, and fake the Hugging Face API, so they never spend inference credits.</w:t>
+        <w:t>). The integration tests start a throwaway MongoDB replica set in memory, run the real Express app against it, and fake the AI provider, so they never spend inference credits.</w:t>
       </w:r>
     </w:p>
     <w:tbl>
@@ -19675,7 +19675,7 @@
         <w:spacing w:after="140" w:line="288" w:lineRule="auto"/>
       </w:pPr>
       <w:r>
-        <w:t>These checks were done by hand in the browser. Rows marked "before the demo" need a real Hugging Face token, Excel, or a fresh database, and should be ticked off on the demo machine.</w:t>
+        <w:t>These checks were done by hand in the browser. Rows marked "before the demo" need Excel or a fresh database, and should be ticked off on the demo machine.</w:t>
       </w:r>
     </w:p>
     <w:tbl>
@@ -20325,7 +20325,7 @@
                 <w:sz w:val="19"/>
                 <w:szCs w:val="19"/>
               </w:rPr>
-              <w:t>All five sample messages with a real Hugging Face token</w:t>
+              <w:t>All seven messages in samples/sms.txt with the real AI (Groq, qwen/qwen3.8-27b): 7 of 7 read correctly, the OTP rejected</w:t>
             </w:r>
           </w:p>
         </w:tc>
@@ -20354,7 +20354,7 @@
                 <w:sz w:val="19"/>
                 <w:szCs w:val="19"/>
               </w:rPr>
-              <w:t>Before the demo</w:t>
+              <w:t>Pass (tested on Groq)</w:t>
             </w:r>
           </w:p>
         </w:tc>
@@ -21263,7 +21263,7 @@
         <w:spacing w:after="140" w:line="288" w:lineRule="auto"/>
       </w:pPr>
       <w:r>
-        <w:t xml:space="preserve">Backup plan: Atlas and Hugging Face both need internet. </w:t>
+        <w:t xml:space="preserve">Backup plan: Atlas and the AI provider both need internet. </w:t>
       </w:r>
       <w:proofErr w:type="spellStart"/>
       <w:r>
@@ -22440,7 +22440,7 @@
                 <w:sz w:val="19"/>
                 <w:szCs w:val="19"/>
               </w:rPr>
-              <w:t>HF_TOKEN</w:t>
+              <w:t>AI_BASE_URL, AI_API_KEY</w:t>
             </w:r>
           </w:p>
         </w:tc>
@@ -22469,7 +22469,7 @@
                 <w:sz w:val="19"/>
                 <w:szCs w:val="19"/>
               </w:rPr>
-              <w:t>Hugging Face token with Inference Providers permission</w:t>
+              <w:t>Address and key of an OpenAI-compatible chat API. Default: Groq (https://api.groq.com/openai/v1), free key from console.groq.com</w:t>
             </w:r>
           </w:p>
         </w:tc>
@@ -22500,7 +22500,7 @@
                 <w:sz w:val="19"/>
                 <w:szCs w:val="19"/>
               </w:rPr>
-              <w:t>HF_MODEL</w:t>
+              <w:t>AI_MODEL</w:t>
             </w:r>
           </w:p>
         </w:tc>
@@ -22529,7 +22529,7 @@
                 <w:sz w:val="19"/>
                 <w:szCs w:val="19"/>
               </w:rPr>
-              <w:t>Text model, e.g. Qwen/Qwen2.5-7B-Instruct</w:t>
+              <w:t>Text model, e.g. qwen/qwen3.8-27b</w:t>
             </w:r>
           </w:p>
         </w:tc>
@@ -22560,7 +22560,7 @@
                 <w:sz w:val="19"/>
                 <w:szCs w:val="19"/>
               </w:rPr>
-              <w:t>HF_VISION_MODEL</w:t>
+              <w:t>AI_VISION_MODEL</w:t>
             </w:r>
           </w:p>
         </w:tc>
@@ -22589,7 +22589,7 @@
                 <w:sz w:val="19"/>
                 <w:szCs w:val="19"/>
               </w:rPr>
-              <w:t>Vision model for bill photos, e.g. Qwen/Qwen2.5-VL-7B-Instruct</w:t>
+              <w:t>Vision model for bill photos, e.g. qwen/qwen3.8-27b</w:t>
             </w:r>
           </w:p>
         </w:tc>

</xml_diff>

<commit_message>
Add one-click demo sign-in; report, README and screenshot updated
POST /api/auth/demo signs in as DEMO_EMAIL on the server, so the demo password
never ships to the browser. The button only shows when a demo account exists.
</commit_message>
<xml_diff>
--- a/docs/FinMan-Project-Report.docx
+++ b/docs/FinMan-Project-Report.docx
@@ -16533,7 +16533,7 @@
           <w:sz w:val="19"/>
           <w:szCs w:val="19"/>
         </w:rPr>
-        <w:t>Figure 8: Sign-in</w:t>
+        <w:t>Figure 8: Sign-in, with the one-click demo account button below the form</w:t>
       </w:r>
     </w:p>
     <w:p>
@@ -17655,7 +17655,7 @@
         <w:spacing w:after="80" w:line="276" w:lineRule="auto"/>
       </w:pPr>
       <w:r>
-        <w:t>The login error is the same for an unknown email and a wrong password, so the endpoint does not reveal which accounts exist.</w:t>
+        <w:t xml:space="preserve">The login error is the same for an unknown email and a wrong password, so the endpoint does not reveal which accounts exist. A one-click demo button signs in as the demo user on the server, so the demo password never reaches the browser, and it only appears when DEMO_EMAIL is set.</w:t>
       </w:r>
     </w:p>
     <w:p>
@@ -18368,7 +18368,7 @@
         <w:spacing w:after="140" w:line="288" w:lineRule="auto"/>
       </w:pPr>
       <w:r>
-        <w:t xml:space="preserve">The backend has 36 automated tests run with Node's built-in test runner. 36 of 36 pass (output saved in </w:t>
+        <w:t xml:space="preserve">The backend has 38 automated tests run with Node's built-in test runner. 38 of 38 pass (output saved in </w:t>
       </w:r>
       <w:r>
         <w:rPr>
@@ -18649,7 +18649,7 @@
                 <w:sz w:val="19"/>
                 <w:szCs w:val="19"/>
               </w:rPr>
-              <w:t>4</w:t>
+              <w:t>6</w:t>
             </w:r>
           </w:p>
         </w:tc>
@@ -18694,7 +18694,7 @@
                 <w:sz w:val="19"/>
                 <w:szCs w:val="19"/>
               </w:rPr>
-              <w:t xml:space="preserve"> cookie, tampered token</w:t>
+              <w:t xml:space="preserve"> cookie, demo sign-in without a password, tampered token</w:t>
             </w:r>
           </w:p>
         </w:tc>
@@ -19628,7 +19628,7 @@
           <w:sz w:val="17"/>
           <w:szCs w:val="17"/>
         </w:rPr>
-        <w:t>ℹ tests 36</w:t>
+        <w:t>ℹ tests 38</w:t>
       </w:r>
     </w:p>
     <w:p>
@@ -19642,7 +19642,7 @@
           <w:sz w:val="17"/>
           <w:szCs w:val="17"/>
         </w:rPr>
-        <w:t>ℹ pass 36</w:t>
+        <w:t>ℹ pass 38</w:t>
       </w:r>
     </w:p>
     <w:p>
@@ -21066,7 +21066,7 @@
         <w:spacing w:after="80" w:line="276" w:lineRule="auto"/>
       </w:pPr>
       <w:r>
-        <w:t>Sign in with the demo account (demo@gmail.com / demo123). Show that the API returns 401 without the session cookie.</w:t>
+        <w:t>Click Try the demo account on the sign-in screen (or sign in as demo@gmail.com / demo123). Show that the API returns 401 without the session cookie.</w:t>
       </w:r>
     </w:p>
     <w:p>

</xml_diff>

<commit_message>
Report: charts check passes (empty month and 90-day view tested)
</commit_message>
<xml_diff>
--- a/docs/FinMan-Project-Report.docx
+++ b/docs/FinMan-Project-Report.docx
@@ -19675,7 +19675,7 @@
         <w:spacing w:after="140" w:line="288" w:lineRule="auto"/>
       </w:pPr>
       <w:r>
-        <w:t>These checks were done by hand in the browser. Rows marked "before the demo" need Excel or a fresh database, and should be ticked off on the demo machine.</w:t>
+        <w:t>These checks were done by hand in the browser. The row marked "before the demo" needs Excel, so check it on the demo machine.</w:t>
       </w:r>
     </w:p>
     <w:tbl>
@@ -20443,7 +20443,7 @@
                 <w:sz w:val="19"/>
                 <w:szCs w:val="19"/>
               </w:rPr>
-              <w:t>Before the demo</w:t>
+              <w:t>Pass</w:t>
             </w:r>
           </w:p>
         </w:tc>

</xml_diff>